<commit_message>
Added doc updates 17th may 26
</commit_message>
<xml_diff>
--- a/git_and_github_commands_part_two_undoing_and_advanced.docx
+++ b/git_and_github_commands_part_two_undoing_and_advanced.docx
@@ -184,12 +184,21 @@
         </w:rPr>
         <w:t xml:space="preserve"> We can get the commit hash from </w:t>
       </w:r>
-      <w:r>
-        <w:rPr>
-          <w:sz w:val="36"/>
-          <w:szCs w:val="36"/>
-        </w:rPr>
-        <w:t>github repo commits and copy that.</w:t>
+      <w:proofErr w:type="spellStart"/>
+      <w:r>
+        <w:rPr>
+          <w:sz w:val="36"/>
+          <w:szCs w:val="36"/>
+        </w:rPr>
+        <w:t>github</w:t>
+      </w:r>
+      <w:proofErr w:type="spellEnd"/>
+      <w:r>
+        <w:rPr>
+          <w:sz w:val="36"/>
+          <w:szCs w:val="36"/>
+        </w:rPr>
+        <w:t xml:space="preserve"> repo commits and copy that.</w:t>
       </w:r>
     </w:p>
     <w:p>
@@ -211,7 +220,29 @@
           <w:sz w:val="36"/>
           <w:szCs w:val="36"/>
         </w:rPr>
-        <w:t>git reset --hard &lt;commit_hash&gt;</w:t>
+        <w:t>git reset --hard &lt;</w:t>
+      </w:r>
+      <w:proofErr w:type="spellStart"/>
+      <w:r>
+        <w:rPr>
+          <w:b/>
+          <w:bCs/>
+          <w:color w:val="D86DCB" w:themeColor="accent5" w:themeTint="99"/>
+          <w:sz w:val="36"/>
+          <w:szCs w:val="36"/>
+        </w:rPr>
+        <w:t>commit_hash</w:t>
+      </w:r>
+      <w:proofErr w:type="spellEnd"/>
+      <w:r>
+        <w:rPr>
+          <w:b/>
+          <w:bCs/>
+          <w:color w:val="D86DCB" w:themeColor="accent5" w:themeTint="99"/>
+          <w:sz w:val="36"/>
+          <w:szCs w:val="36"/>
+        </w:rPr>
+        <w:t>&gt;</w:t>
       </w:r>
     </w:p>
     <w:p>
@@ -257,7 +288,29 @@
           <w:sz w:val="36"/>
           <w:szCs w:val="36"/>
         </w:rPr>
-        <w:t>git reset --soft &lt;commit_hash&gt;</w:t>
+        <w:t>git reset --soft &lt;</w:t>
+      </w:r>
+      <w:proofErr w:type="spellStart"/>
+      <w:r>
+        <w:rPr>
+          <w:b/>
+          <w:bCs/>
+          <w:color w:val="D86DCB" w:themeColor="accent5" w:themeTint="99"/>
+          <w:sz w:val="36"/>
+          <w:szCs w:val="36"/>
+        </w:rPr>
+        <w:t>commit_hash</w:t>
+      </w:r>
+      <w:proofErr w:type="spellEnd"/>
+      <w:r>
+        <w:rPr>
+          <w:b/>
+          <w:bCs/>
+          <w:color w:val="D86DCB" w:themeColor="accent5" w:themeTint="99"/>
+          <w:sz w:val="36"/>
+          <w:szCs w:val="36"/>
+        </w:rPr>
+        <w:t>&gt;</w:t>
       </w:r>
     </w:p>
     <w:p>
@@ -284,8 +337,19 @@
           <w:sz w:val="36"/>
           <w:szCs w:val="36"/>
         </w:rPr>
-        <w:t>git revert</w:t>
-      </w:r>
+        <w:t xml:space="preserve">git </w:t>
+      </w:r>
+      <w:proofErr w:type="gramStart"/>
+      <w:r>
+        <w:rPr>
+          <w:b/>
+          <w:bCs/>
+          <w:sz w:val="36"/>
+          <w:szCs w:val="36"/>
+        </w:rPr>
+        <w:t>revert</w:t>
+      </w:r>
+      <w:proofErr w:type="gramEnd"/>
       <w:r>
         <w:rPr>
           <w:b/>
@@ -338,7 +402,29 @@
           <w:sz w:val="36"/>
           <w:szCs w:val="36"/>
         </w:rPr>
-        <w:t>git revert &lt;commit_hash&gt;</w:t>
+        <w:t>git revert &lt;</w:t>
+      </w:r>
+      <w:proofErr w:type="spellStart"/>
+      <w:r>
+        <w:rPr>
+          <w:b/>
+          <w:bCs/>
+          <w:color w:val="D86DCB" w:themeColor="accent5" w:themeTint="99"/>
+          <w:sz w:val="36"/>
+          <w:szCs w:val="36"/>
+        </w:rPr>
+        <w:t>commit_hash</w:t>
+      </w:r>
+      <w:proofErr w:type="spellEnd"/>
+      <w:r>
+        <w:rPr>
+          <w:b/>
+          <w:bCs/>
+          <w:color w:val="D86DCB" w:themeColor="accent5" w:themeTint="99"/>
+          <w:sz w:val="36"/>
+          <w:szCs w:val="36"/>
+        </w:rPr>
+        <w:t>&gt;</w:t>
       </w:r>
     </w:p>
     <w:p>
@@ -526,7 +612,23 @@
           <w:sz w:val="36"/>
           <w:szCs w:val="36"/>
         </w:rPr>
-        <w:t>Undo unstaged changes (reset file to last commit):</w:t>
+        <w:t xml:space="preserve">Undo </w:t>
+      </w:r>
+      <w:proofErr w:type="spellStart"/>
+      <w:r>
+        <w:rPr>
+          <w:sz w:val="36"/>
+          <w:szCs w:val="36"/>
+        </w:rPr>
+        <w:t>unstaged</w:t>
+      </w:r>
+      <w:proofErr w:type="spellEnd"/>
+      <w:r>
+        <w:rPr>
+          <w:sz w:val="36"/>
+          <w:szCs w:val="36"/>
+        </w:rPr>
+        <w:t xml:space="preserve"> changes (reset file to last commit):</w:t>
       </w:r>
     </w:p>
     <w:p>
@@ -816,8 +918,20 @@
           <w:sz w:val="36"/>
           <w:szCs w:val="36"/>
         </w:rPr>
-        <w:t>git stash apply</w:t>
-      </w:r>
+        <w:t xml:space="preserve">git stash </w:t>
+      </w:r>
+      <w:proofErr w:type="gramStart"/>
+      <w:r>
+        <w:rPr>
+          <w:b/>
+          <w:bCs/>
+          <w:color w:val="D86DCB" w:themeColor="accent5" w:themeTint="99"/>
+          <w:sz w:val="36"/>
+          <w:szCs w:val="36"/>
+        </w:rPr>
+        <w:t>apply</w:t>
+      </w:r>
+      <w:proofErr w:type="gramEnd"/>
     </w:p>
     <w:p>
       <w:pPr>
@@ -907,7 +1021,29 @@
           <w:sz w:val="36"/>
           <w:szCs w:val="36"/>
         </w:rPr>
-        <w:t>git stash drop stash@{0}</w:t>
+        <w:t>git stash drop stash</w:t>
+      </w:r>
+      <w:proofErr w:type="gramStart"/>
+      <w:r>
+        <w:rPr>
+          <w:b/>
+          <w:bCs/>
+          <w:color w:val="D86DCB" w:themeColor="accent5" w:themeTint="99"/>
+          <w:sz w:val="36"/>
+          <w:szCs w:val="36"/>
+        </w:rPr>
+        <w:t>@{</w:t>
+      </w:r>
+      <w:proofErr w:type="gramEnd"/>
+      <w:r>
+        <w:rPr>
+          <w:b/>
+          <w:bCs/>
+          <w:color w:val="D86DCB" w:themeColor="accent5" w:themeTint="99"/>
+          <w:sz w:val="36"/>
+          <w:szCs w:val="36"/>
+        </w:rPr>
+        <w:t>0}</w:t>
       </w:r>
     </w:p>
     <w:p>
@@ -978,7 +1114,23 @@
           <w:sz w:val="36"/>
           <w:szCs w:val="36"/>
         </w:rPr>
-        <w:t>ecover Deleted Branches &amp; Commits (git reflog)</w:t>
+        <w:t xml:space="preserve">ecover Deleted Branches &amp; Commits (git </w:t>
+      </w:r>
+      <w:proofErr w:type="spellStart"/>
+      <w:r>
+        <w:rPr>
+          <w:sz w:val="36"/>
+          <w:szCs w:val="36"/>
+        </w:rPr>
+        <w:t>reflog</w:t>
+      </w:r>
+      <w:proofErr w:type="spellEnd"/>
+      <w:r>
+        <w:rPr>
+          <w:sz w:val="36"/>
+          <w:szCs w:val="36"/>
+        </w:rPr>
+        <w:t>)</w:t>
       </w:r>
       <w:r>
         <w:rPr>
@@ -1036,7 +1188,23 @@
           <w:sz w:val="36"/>
           <w:szCs w:val="36"/>
         </w:rPr>
-        <w:t>View reflog:</w:t>
+        <w:t xml:space="preserve">View </w:t>
+      </w:r>
+      <w:proofErr w:type="spellStart"/>
+      <w:r>
+        <w:rPr>
+          <w:sz w:val="36"/>
+          <w:szCs w:val="36"/>
+        </w:rPr>
+        <w:t>reflog</w:t>
+      </w:r>
+      <w:proofErr w:type="spellEnd"/>
+      <w:r>
+        <w:rPr>
+          <w:sz w:val="36"/>
+          <w:szCs w:val="36"/>
+        </w:rPr>
+        <w:t>:</w:t>
       </w:r>
     </w:p>
     <w:p>
@@ -1058,8 +1226,20 @@
           <w:sz w:val="36"/>
           <w:szCs w:val="36"/>
         </w:rPr>
-        <w:t>git reflog</w:t>
-      </w:r>
+        <w:t xml:space="preserve">git </w:t>
+      </w:r>
+      <w:proofErr w:type="spellStart"/>
+      <w:r>
+        <w:rPr>
+          <w:b/>
+          <w:bCs/>
+          <w:color w:val="D86DCB" w:themeColor="accent5" w:themeTint="99"/>
+          <w:sz w:val="36"/>
+          <w:szCs w:val="36"/>
+        </w:rPr>
+        <w:t>reflog</w:t>
+      </w:r>
+      <w:proofErr w:type="spellEnd"/>
     </w:p>
     <w:p>
       <w:pPr>
@@ -1103,12 +1283,10 @@
           <w:sz w:val="36"/>
           <w:szCs w:val="36"/>
         </w:rPr>
-        <w:t>a1b2c3d HEAD@{0}: commit: Fix bug</w:t>
-      </w:r>
-    </w:p>
-    <w:p>
-      <w:pPr>
-        <w:jc w:val="both"/>
+        <w:t>a1b2c3d HEAD</w:t>
+      </w:r>
+      <w:proofErr w:type="gramStart"/>
+      <w:r>
         <w:rPr>
           <w:b/>
           <w:bCs/>
@@ -1116,7 +1294,9 @@
           <w:sz w:val="36"/>
           <w:szCs w:val="36"/>
         </w:rPr>
-      </w:pPr>
+        <w:t>@{</w:t>
+      </w:r>
+      <w:proofErr w:type="gramEnd"/>
       <w:r>
         <w:rPr>
           <w:b/>
@@ -1125,7 +1305,7 @@
           <w:sz w:val="36"/>
           <w:szCs w:val="36"/>
         </w:rPr>
-        <w:t>d4e5f6g HEAD@{1}: commit: Add feature</w:t>
+        <w:t>0}: commit: Fix bug</w:t>
       </w:r>
     </w:p>
     <w:p>
@@ -1147,7 +1327,73 @@
           <w:sz w:val="36"/>
           <w:szCs w:val="36"/>
         </w:rPr>
-        <w:t>h7i8j9k HEAD@{2}: checkout: moving from main to feature</w:t>
+        <w:t>d4e5f6g HEAD</w:t>
+      </w:r>
+      <w:proofErr w:type="gramStart"/>
+      <w:r>
+        <w:rPr>
+          <w:b/>
+          <w:bCs/>
+          <w:color w:val="D86DCB" w:themeColor="accent5" w:themeTint="99"/>
+          <w:sz w:val="36"/>
+          <w:szCs w:val="36"/>
+        </w:rPr>
+        <w:t>@{</w:t>
+      </w:r>
+      <w:proofErr w:type="gramEnd"/>
+      <w:r>
+        <w:rPr>
+          <w:b/>
+          <w:bCs/>
+          <w:color w:val="D86DCB" w:themeColor="accent5" w:themeTint="99"/>
+          <w:sz w:val="36"/>
+          <w:szCs w:val="36"/>
+        </w:rPr>
+        <w:t>1}: commit: Add feature</w:t>
+      </w:r>
+    </w:p>
+    <w:p>
+      <w:pPr>
+        <w:jc w:val="both"/>
+        <w:rPr>
+          <w:b/>
+          <w:bCs/>
+          <w:color w:val="D86DCB" w:themeColor="accent5" w:themeTint="99"/>
+          <w:sz w:val="36"/>
+          <w:szCs w:val="36"/>
+        </w:rPr>
+      </w:pPr>
+      <w:r>
+        <w:rPr>
+          <w:b/>
+          <w:bCs/>
+          <w:color w:val="D86DCB" w:themeColor="accent5" w:themeTint="99"/>
+          <w:sz w:val="36"/>
+          <w:szCs w:val="36"/>
+        </w:rPr>
+        <w:t>h7i8j9k HEAD</w:t>
+      </w:r>
+      <w:proofErr w:type="gramStart"/>
+      <w:r>
+        <w:rPr>
+          <w:b/>
+          <w:bCs/>
+          <w:color w:val="D86DCB" w:themeColor="accent5" w:themeTint="99"/>
+          <w:sz w:val="36"/>
+          <w:szCs w:val="36"/>
+        </w:rPr>
+        <w:t>@{</w:t>
+      </w:r>
+      <w:proofErr w:type="gramEnd"/>
+      <w:r>
+        <w:rPr>
+          <w:b/>
+          <w:bCs/>
+          <w:color w:val="D86DCB" w:themeColor="accent5" w:themeTint="99"/>
+          <w:sz w:val="36"/>
+          <w:szCs w:val="36"/>
+        </w:rPr>
+        <w:t>2}: checkout: moving from main to feature</w:t>
       </w:r>
     </w:p>
     <w:p>
@@ -1192,7 +1438,51 @@
           <w:sz w:val="36"/>
           <w:szCs w:val="36"/>
         </w:rPr>
-        <w:t>git checkout -b recovered_branch &lt;commit_hash&gt;</w:t>
+        <w:t xml:space="preserve">git checkout -b </w:t>
+      </w:r>
+      <w:proofErr w:type="spellStart"/>
+      <w:r>
+        <w:rPr>
+          <w:b/>
+          <w:bCs/>
+          <w:color w:val="D86DCB" w:themeColor="accent5" w:themeTint="99"/>
+          <w:sz w:val="36"/>
+          <w:szCs w:val="36"/>
+        </w:rPr>
+        <w:t>recovered_branch</w:t>
+      </w:r>
+      <w:proofErr w:type="spellEnd"/>
+      <w:r>
+        <w:rPr>
+          <w:b/>
+          <w:bCs/>
+          <w:color w:val="D86DCB" w:themeColor="accent5" w:themeTint="99"/>
+          <w:sz w:val="36"/>
+          <w:szCs w:val="36"/>
+        </w:rPr>
+        <w:t xml:space="preserve"> &lt;</w:t>
+      </w:r>
+      <w:proofErr w:type="spellStart"/>
+      <w:r>
+        <w:rPr>
+          <w:b/>
+          <w:bCs/>
+          <w:color w:val="D86DCB" w:themeColor="accent5" w:themeTint="99"/>
+          <w:sz w:val="36"/>
+          <w:szCs w:val="36"/>
+        </w:rPr>
+        <w:t>commit_hash</w:t>
+      </w:r>
+      <w:proofErr w:type="spellEnd"/>
+      <w:r>
+        <w:rPr>
+          <w:b/>
+          <w:bCs/>
+          <w:color w:val="D86DCB" w:themeColor="accent5" w:themeTint="99"/>
+          <w:sz w:val="36"/>
+          <w:szCs w:val="36"/>
+        </w:rPr>
+        <w:t>&gt;</w:t>
       </w:r>
     </w:p>
     <w:p>
@@ -1247,7 +1537,23 @@
           <w:sz w:val="36"/>
           <w:szCs w:val="36"/>
         </w:rPr>
-        <w:t>Quick Cheatsheet:</w:t>
+        <w:t xml:space="preserve">Quick </w:t>
+      </w:r>
+      <w:proofErr w:type="spellStart"/>
+      <w:r>
+        <w:rPr>
+          <w:sz w:val="36"/>
+          <w:szCs w:val="36"/>
+        </w:rPr>
+        <w:t>Cheatsheet</w:t>
+      </w:r>
+      <w:proofErr w:type="spellEnd"/>
+      <w:r>
+        <w:rPr>
+          <w:sz w:val="36"/>
+          <w:szCs w:val="36"/>
+        </w:rPr>
+        <w:t>:</w:t>
       </w:r>
     </w:p>
     <w:tbl>
@@ -1477,7 +1783,23 @@
                 <w:sz w:val="36"/>
                 <w:szCs w:val="36"/>
               </w:rPr>
-              <w:t>git revert &lt;commit_hash&gt;</w:t>
+              <w:t>git revert &lt;</w:t>
+            </w:r>
+            <w:proofErr w:type="spellStart"/>
+            <w:r>
+              <w:rPr>
+                <w:sz w:val="36"/>
+                <w:szCs w:val="36"/>
+              </w:rPr>
+              <w:t>commit_hash</w:t>
+            </w:r>
+            <w:proofErr w:type="spellEnd"/>
+            <w:r>
+              <w:rPr>
+                <w:sz w:val="36"/>
+                <w:szCs w:val="36"/>
+              </w:rPr>
+              <w:t>&gt;</w:t>
             </w:r>
           </w:p>
         </w:tc>
@@ -1507,7 +1829,27 @@
                 <w:sz w:val="36"/>
                 <w:szCs w:val="36"/>
               </w:rPr>
-              <w:t>Undo unstaged file changes</w:t>
+              <w:t xml:space="preserve">Undo </w:t>
+            </w:r>
+            <w:proofErr w:type="spellStart"/>
+            <w:r>
+              <w:rPr>
+                <w:b w:val="0"/>
+                <w:bCs w:val="0"/>
+                <w:sz w:val="36"/>
+                <w:szCs w:val="36"/>
+              </w:rPr>
+              <w:t>unstaged</w:t>
+            </w:r>
+            <w:proofErr w:type="spellEnd"/>
+            <w:r>
+              <w:rPr>
+                <w:b w:val="0"/>
+                <w:bCs w:val="0"/>
+                <w:sz w:val="36"/>
+                <w:szCs w:val="36"/>
+              </w:rPr>
+              <w:t xml:space="preserve"> file changes</w:t>
             </w:r>
           </w:p>
         </w:tc>
@@ -1753,7 +2095,39 @@
                 <w:sz w:val="36"/>
                 <w:szCs w:val="36"/>
               </w:rPr>
-              <w:t>git reflog + git checkout -b newbranch &lt;hash&gt;</w:t>
+              <w:t xml:space="preserve">git </w:t>
+            </w:r>
+            <w:proofErr w:type="spellStart"/>
+            <w:r>
+              <w:rPr>
+                <w:sz w:val="36"/>
+                <w:szCs w:val="36"/>
+              </w:rPr>
+              <w:t>reflog</w:t>
+            </w:r>
+            <w:proofErr w:type="spellEnd"/>
+            <w:r>
+              <w:rPr>
+                <w:sz w:val="36"/>
+                <w:szCs w:val="36"/>
+              </w:rPr>
+              <w:t xml:space="preserve"> + git checkout -b </w:t>
+            </w:r>
+            <w:proofErr w:type="spellStart"/>
+            <w:r>
+              <w:rPr>
+                <w:sz w:val="36"/>
+                <w:szCs w:val="36"/>
+              </w:rPr>
+              <w:t>newbranch</w:t>
+            </w:r>
+            <w:proofErr w:type="spellEnd"/>
+            <w:r>
+              <w:rPr>
+                <w:sz w:val="36"/>
+                <w:szCs w:val="36"/>
+              </w:rPr>
+              <w:t xml:space="preserve"> &lt;hash&gt;</w:t>
             </w:r>
           </w:p>
         </w:tc>
@@ -2814,7 +3188,23 @@
           <w:sz w:val="36"/>
           <w:szCs w:val="36"/>
         </w:rPr>
-        <w:t xml:space="preserve"> Name it </w:t>
+        <w:t xml:space="preserve"> Name </w:t>
+      </w:r>
+      <w:proofErr w:type="gramStart"/>
+      <w:r>
+        <w:rPr>
+          <w:sz w:val="36"/>
+          <w:szCs w:val="36"/>
+        </w:rPr>
+        <w:t>it</w:t>
+      </w:r>
+      <w:proofErr w:type="gramEnd"/>
+      <w:r>
+        <w:rPr>
+          <w:sz w:val="36"/>
+          <w:szCs w:val="36"/>
+        </w:rPr>
+        <w:t xml:space="preserve"> </w:t>
       </w:r>
       <w:r>
         <w:rPr>
@@ -3654,6 +4044,315 @@
           <w:szCs w:val="36"/>
         </w:rPr>
       </w:pPr>
+      <w:r>
+        <w:rPr>
+          <w:sz w:val="36"/>
+          <w:szCs w:val="36"/>
+        </w:rPr>
+        <w:t># The full list of keywords GitHub recognizes; all do the same thing:</w:t>
+      </w:r>
+    </w:p>
+    <w:p>
+      <w:pPr>
+        <w:jc w:val="both"/>
+        <w:rPr>
+          <w:b/>
+          <w:bCs/>
+          <w:sz w:val="36"/>
+          <w:szCs w:val="36"/>
+        </w:rPr>
+      </w:pPr>
+      <w:r>
+        <w:rPr>
+          <w:b/>
+          <w:bCs/>
+          <w:sz w:val="36"/>
+          <w:szCs w:val="36"/>
+        </w:rPr>
+        <w:t>close #1</w:t>
+      </w:r>
+    </w:p>
+    <w:p>
+      <w:pPr>
+        <w:jc w:val="both"/>
+        <w:rPr>
+          <w:b/>
+          <w:bCs/>
+          <w:sz w:val="36"/>
+          <w:szCs w:val="36"/>
+        </w:rPr>
+      </w:pPr>
+      <w:r>
+        <w:rPr>
+          <w:b/>
+          <w:bCs/>
+          <w:sz w:val="36"/>
+          <w:szCs w:val="36"/>
+        </w:rPr>
+        <w:t>closes #1</w:t>
+      </w:r>
+    </w:p>
+    <w:p>
+      <w:pPr>
+        <w:jc w:val="both"/>
+        <w:rPr>
+          <w:b/>
+          <w:bCs/>
+          <w:sz w:val="36"/>
+          <w:szCs w:val="36"/>
+        </w:rPr>
+      </w:pPr>
+      <w:r>
+        <w:rPr>
+          <w:b/>
+          <w:bCs/>
+          <w:sz w:val="36"/>
+          <w:szCs w:val="36"/>
+        </w:rPr>
+        <w:t>closed #1</w:t>
+      </w:r>
+    </w:p>
+    <w:p>
+      <w:pPr>
+        <w:jc w:val="both"/>
+        <w:rPr>
+          <w:b/>
+          <w:bCs/>
+          <w:sz w:val="36"/>
+          <w:szCs w:val="36"/>
+        </w:rPr>
+      </w:pPr>
+      <w:r>
+        <w:rPr>
+          <w:b/>
+          <w:bCs/>
+          <w:sz w:val="36"/>
+          <w:szCs w:val="36"/>
+        </w:rPr>
+        <w:t>fix #1</w:t>
+      </w:r>
+    </w:p>
+    <w:p>
+      <w:pPr>
+        <w:jc w:val="both"/>
+        <w:rPr>
+          <w:b/>
+          <w:bCs/>
+          <w:sz w:val="36"/>
+          <w:szCs w:val="36"/>
+        </w:rPr>
+      </w:pPr>
+      <w:r>
+        <w:rPr>
+          <w:b/>
+          <w:bCs/>
+          <w:sz w:val="36"/>
+          <w:szCs w:val="36"/>
+        </w:rPr>
+        <w:t>fixes #1</w:t>
+      </w:r>
+    </w:p>
+    <w:p>
+      <w:pPr>
+        <w:jc w:val="both"/>
+        <w:rPr>
+          <w:b/>
+          <w:bCs/>
+          <w:sz w:val="36"/>
+          <w:szCs w:val="36"/>
+        </w:rPr>
+      </w:pPr>
+      <w:r>
+        <w:rPr>
+          <w:b/>
+          <w:bCs/>
+          <w:sz w:val="36"/>
+          <w:szCs w:val="36"/>
+        </w:rPr>
+        <w:t>fixed #1</w:t>
+      </w:r>
+    </w:p>
+    <w:p>
+      <w:pPr>
+        <w:jc w:val="both"/>
+        <w:rPr>
+          <w:b/>
+          <w:bCs/>
+          <w:sz w:val="36"/>
+          <w:szCs w:val="36"/>
+        </w:rPr>
+      </w:pPr>
+      <w:r>
+        <w:rPr>
+          <w:b/>
+          <w:bCs/>
+          <w:sz w:val="36"/>
+          <w:szCs w:val="36"/>
+        </w:rPr>
+        <w:t>resolve #1</w:t>
+      </w:r>
+    </w:p>
+    <w:p>
+      <w:pPr>
+        <w:jc w:val="both"/>
+        <w:rPr>
+          <w:b/>
+          <w:bCs/>
+          <w:sz w:val="36"/>
+          <w:szCs w:val="36"/>
+        </w:rPr>
+      </w:pPr>
+      <w:r>
+        <w:rPr>
+          <w:b/>
+          <w:bCs/>
+          <w:sz w:val="36"/>
+          <w:szCs w:val="36"/>
+        </w:rPr>
+        <w:t>resolves #1</w:t>
+      </w:r>
+    </w:p>
+    <w:p>
+      <w:pPr>
+        <w:jc w:val="both"/>
+        <w:rPr>
+          <w:b/>
+          <w:bCs/>
+          <w:sz w:val="36"/>
+          <w:szCs w:val="36"/>
+        </w:rPr>
+      </w:pPr>
+      <w:r>
+        <w:rPr>
+          <w:b/>
+          <w:bCs/>
+          <w:sz w:val="36"/>
+          <w:szCs w:val="36"/>
+        </w:rPr>
+        <w:t>resolved #1</w:t>
+      </w:r>
+    </w:p>
+    <w:p>
+      <w:pPr>
+        <w:jc w:val="both"/>
+        <w:rPr>
+          <w:sz w:val="36"/>
+          <w:szCs w:val="36"/>
+        </w:rPr>
+      </w:pPr>
+      <w:r>
+        <w:rPr>
+          <w:sz w:val="36"/>
+          <w:szCs w:val="36"/>
+        </w:rPr>
+        <w:lastRenderedPageBreak/>
+        <w:t># Don’t do this. It’s wrong and only closes #1 (issue)</w:t>
+      </w:r>
+    </w:p>
+    <w:p>
+      <w:pPr>
+        <w:jc w:val="both"/>
+        <w:rPr>
+          <w:b/>
+          <w:bCs/>
+          <w:sz w:val="36"/>
+          <w:szCs w:val="36"/>
+        </w:rPr>
+      </w:pPr>
+      <w:r>
+        <w:rPr>
+          <w:b/>
+          <w:bCs/>
+          <w:sz w:val="36"/>
+          <w:szCs w:val="36"/>
+        </w:rPr>
+        <w:t>Closes #1, #2, #3</w:t>
+      </w:r>
+    </w:p>
+    <w:p>
+      <w:pPr>
+        <w:jc w:val="both"/>
+        <w:rPr>
+          <w:sz w:val="36"/>
+          <w:szCs w:val="36"/>
+        </w:rPr>
+      </w:pPr>
+      <w:r>
+        <w:rPr>
+          <w:sz w:val="36"/>
+          <w:szCs w:val="36"/>
+        </w:rPr>
+        <w:t># Right way, closes all three</w:t>
+      </w:r>
+    </w:p>
+    <w:p>
+      <w:pPr>
+        <w:jc w:val="both"/>
+        <w:rPr>
+          <w:b/>
+          <w:bCs/>
+          <w:sz w:val="36"/>
+          <w:szCs w:val="36"/>
+        </w:rPr>
+      </w:pPr>
+      <w:r>
+        <w:rPr>
+          <w:b/>
+          <w:bCs/>
+          <w:sz w:val="36"/>
+          <w:szCs w:val="36"/>
+        </w:rPr>
+        <w:t>Closes #1</w:t>
+      </w:r>
+    </w:p>
+    <w:p>
+      <w:pPr>
+        <w:jc w:val="both"/>
+        <w:rPr>
+          <w:b/>
+          <w:bCs/>
+          <w:sz w:val="36"/>
+          <w:szCs w:val="36"/>
+        </w:rPr>
+      </w:pPr>
+      <w:r>
+        <w:rPr>
+          <w:b/>
+          <w:bCs/>
+          <w:sz w:val="36"/>
+          <w:szCs w:val="36"/>
+        </w:rPr>
+        <w:t>Closes #2</w:t>
+      </w:r>
+    </w:p>
+    <w:p>
+      <w:pPr>
+        <w:jc w:val="both"/>
+        <w:rPr>
+          <w:b/>
+          <w:bCs/>
+          <w:sz w:val="36"/>
+          <w:szCs w:val="36"/>
+        </w:rPr>
+      </w:pPr>
+      <w:r>
+        <w:rPr>
+          <w:b/>
+          <w:bCs/>
+          <w:sz w:val="36"/>
+          <w:szCs w:val="36"/>
+        </w:rPr>
+        <w:t>Closes #3</w:t>
+      </w:r>
+    </w:p>
+    <w:p>
+      <w:pPr>
+        <w:jc w:val="both"/>
+        <w:rPr>
+          <w:sz w:val="36"/>
+          <w:szCs w:val="36"/>
+        </w:rPr>
+      </w:pPr>
     </w:p>
     <w:p>
       <w:pPr>
@@ -3882,7 +4581,226 @@
           <w:sz w:val="36"/>
           <w:szCs w:val="36"/>
         </w:rPr>
+        <w:t>we</w:t>
+      </w:r>
+      <w:r>
+        <w:rPr>
+          <w:sz w:val="36"/>
+          <w:szCs w:val="36"/>
+        </w:rPr>
+        <w:t xml:space="preserve">'re creating "draft notes" instead of real issues, </w:t>
+      </w:r>
+      <w:r>
+        <w:rPr>
+          <w:sz w:val="36"/>
+          <w:szCs w:val="36"/>
+        </w:rPr>
+        <w:t>we</w:t>
+      </w:r>
+      <w:r>
+        <w:rPr>
+          <w:sz w:val="36"/>
+          <w:szCs w:val="36"/>
+        </w:rPr>
+        <w:t xml:space="preserve"> lose all the automation power.</w:t>
+      </w:r>
+    </w:p>
+    <w:p>
+      <w:pPr>
+        <w:jc w:val="both"/>
+        <w:rPr>
+          <w:sz w:val="36"/>
+          <w:szCs w:val="36"/>
+        </w:rPr>
+      </w:pPr>
+      <w:r>
+        <w:rPr>
+          <w:sz w:val="36"/>
+          <w:szCs w:val="36"/>
+        </w:rPr>
+        <w:t xml:space="preserve"># </w:t>
+      </w:r>
+      <w:r>
+        <w:rPr>
+          <w:b/>
+          <w:bCs/>
+          <w:sz w:val="36"/>
+          <w:szCs w:val="36"/>
+        </w:rPr>
+        <w:t>Mistake-2,</w:t>
+      </w:r>
+      <w:r>
+        <w:rPr>
+          <w:sz w:val="36"/>
+          <w:szCs w:val="36"/>
+        </w:rPr>
+        <w:t xml:space="preserve"> N</w:t>
+      </w:r>
+      <w:r>
+        <w:rPr>
+          <w:sz w:val="36"/>
+          <w:szCs w:val="36"/>
+        </w:rPr>
+        <w:t>ot using the "</w:t>
+      </w:r>
+      <w:r>
+        <w:rPr>
+          <w:b/>
+          <w:bCs/>
+          <w:sz w:val="36"/>
+          <w:szCs w:val="36"/>
+        </w:rPr>
+        <w:t>Closes #N</w:t>
+      </w:r>
+      <w:r>
+        <w:rPr>
+          <w:sz w:val="36"/>
+          <w:szCs w:val="36"/>
+        </w:rPr>
+        <w:t>" keyword in PRs</w:t>
+      </w:r>
+      <w:r>
+        <w:rPr>
+          <w:sz w:val="36"/>
+          <w:szCs w:val="36"/>
+        </w:rPr>
+        <w:t xml:space="preserve">. </w:t>
+      </w:r>
+      <w:r>
+        <w:rPr>
+          <w:sz w:val="36"/>
+          <w:szCs w:val="36"/>
+        </w:rPr>
+        <w:t>Most beginners write PRs without linking them to issues. This breaks the automation chain completely.</w:t>
+      </w:r>
+    </w:p>
+    <w:p>
+      <w:pPr>
+        <w:jc w:val="both"/>
+        <w:rPr>
+          <w:sz w:val="36"/>
+          <w:szCs w:val="36"/>
+        </w:rPr>
+      </w:pPr>
+      <w:r>
+        <w:rPr>
+          <w:sz w:val="36"/>
+          <w:szCs w:val="36"/>
+        </w:rPr>
         <w:lastRenderedPageBreak/>
+        <w:t xml:space="preserve"># </w:t>
+      </w:r>
+      <w:r>
+        <w:rPr>
+          <w:b/>
+          <w:bCs/>
+          <w:sz w:val="36"/>
+          <w:szCs w:val="36"/>
+        </w:rPr>
+        <w:t>Mistake-3</w:t>
+      </w:r>
+      <w:r>
+        <w:rPr>
+          <w:sz w:val="36"/>
+          <w:szCs w:val="36"/>
+        </w:rPr>
+        <w:t>,</w:t>
+      </w:r>
+      <w:r>
+        <w:rPr>
+          <w:sz w:val="36"/>
+          <w:szCs w:val="36"/>
+        </w:rPr>
+        <w:t xml:space="preserve"> One giant project for everything</w:t>
+      </w:r>
+      <w:r>
+        <w:rPr>
+          <w:sz w:val="36"/>
+          <w:szCs w:val="36"/>
+        </w:rPr>
+        <w:t xml:space="preserve">. </w:t>
+      </w:r>
+      <w:r>
+        <w:rPr>
+          <w:sz w:val="36"/>
+          <w:szCs w:val="36"/>
+        </w:rPr>
+        <w:t>Teams with 5+ repos often put ALL work in one board with no filtering. Use views (saved filters) inside our project to show only "Flutter issues" or "this sprint's work."</w:t>
+      </w:r>
+    </w:p>
+    <w:p>
+      <w:pPr>
+        <w:jc w:val="both"/>
+        <w:rPr>
+          <w:sz w:val="36"/>
+          <w:szCs w:val="36"/>
+        </w:rPr>
+      </w:pPr>
+      <w:r>
+        <w:rPr>
+          <w:sz w:val="36"/>
+          <w:szCs w:val="36"/>
+        </w:rPr>
+        <w:t xml:space="preserve"># </w:t>
+      </w:r>
+      <w:r>
+        <w:rPr>
+          <w:b/>
+          <w:bCs/>
+          <w:sz w:val="36"/>
+          <w:szCs w:val="36"/>
+        </w:rPr>
+        <w:t>Mistake-4</w:t>
+      </w:r>
+      <w:r>
+        <w:rPr>
+          <w:sz w:val="36"/>
+          <w:szCs w:val="36"/>
+        </w:rPr>
+        <w:t>,</w:t>
+      </w:r>
+      <w:r>
+        <w:rPr>
+          <w:sz w:val="36"/>
+          <w:szCs w:val="36"/>
+        </w:rPr>
+        <w:t xml:space="preserve"> Ignoring the Roadmap view</w:t>
+      </w:r>
+      <w:r>
+        <w:rPr>
+          <w:sz w:val="36"/>
+          <w:szCs w:val="36"/>
+        </w:rPr>
+        <w:t xml:space="preserve">. </w:t>
+      </w:r>
+      <w:r>
+        <w:rPr>
+          <w:sz w:val="36"/>
+          <w:szCs w:val="36"/>
+        </w:rPr>
+        <w:t xml:space="preserve">Solo </w:t>
+      </w:r>
+      <w:proofErr w:type="spellStart"/>
+      <w:r>
+        <w:rPr>
+          <w:sz w:val="36"/>
+          <w:szCs w:val="36"/>
+        </w:rPr>
+        <w:t>devs</w:t>
+      </w:r>
+      <w:proofErr w:type="spellEnd"/>
+      <w:r>
+        <w:rPr>
+          <w:sz w:val="36"/>
+          <w:szCs w:val="36"/>
+        </w:rPr>
+        <w:t xml:space="preserve"> never touch it. But when </w:t>
+      </w:r>
+      <w:r>
+        <w:rPr>
+          <w:sz w:val="36"/>
+          <w:szCs w:val="36"/>
+        </w:rPr>
         <w:t>we</w:t>
       </w:r>
       <w:r>
@@ -3890,210 +4808,23 @@
           <w:sz w:val="36"/>
           <w:szCs w:val="36"/>
         </w:rPr>
-        <w:t xml:space="preserve">'re creating "draft notes" instead of real issues, </w:t>
-      </w:r>
-      <w:r>
-        <w:rPr>
-          <w:sz w:val="36"/>
-          <w:szCs w:val="36"/>
-        </w:rPr>
-        <w:t>we</w:t>
-      </w:r>
-      <w:r>
-        <w:rPr>
-          <w:sz w:val="36"/>
-          <w:szCs w:val="36"/>
-        </w:rPr>
-        <w:t xml:space="preserve"> lose all the automation power.</w:t>
-      </w:r>
-    </w:p>
-    <w:p>
-      <w:pPr>
-        <w:jc w:val="both"/>
-        <w:rPr>
-          <w:sz w:val="36"/>
-          <w:szCs w:val="36"/>
-        </w:rPr>
-      </w:pPr>
-      <w:r>
-        <w:rPr>
-          <w:sz w:val="36"/>
-          <w:szCs w:val="36"/>
-        </w:rPr>
-        <w:t xml:space="preserve"># </w:t>
-      </w:r>
-      <w:r>
-        <w:rPr>
-          <w:b/>
-          <w:bCs/>
-          <w:sz w:val="36"/>
-          <w:szCs w:val="36"/>
-        </w:rPr>
-        <w:t>Mistake-2,</w:t>
-      </w:r>
-      <w:r>
-        <w:rPr>
-          <w:sz w:val="36"/>
-          <w:szCs w:val="36"/>
-        </w:rPr>
-        <w:t xml:space="preserve"> N</w:t>
-      </w:r>
-      <w:r>
-        <w:rPr>
-          <w:sz w:val="36"/>
-          <w:szCs w:val="36"/>
-        </w:rPr>
-        <w:t>ot using the "</w:t>
-      </w:r>
-      <w:r>
-        <w:rPr>
-          <w:b/>
-          <w:bCs/>
-          <w:sz w:val="36"/>
-          <w:szCs w:val="36"/>
-        </w:rPr>
-        <w:t>Closes #N</w:t>
-      </w:r>
-      <w:r>
-        <w:rPr>
-          <w:sz w:val="36"/>
-          <w:szCs w:val="36"/>
-        </w:rPr>
-        <w:t>" keyword in PRs</w:t>
-      </w:r>
-      <w:r>
-        <w:rPr>
-          <w:sz w:val="36"/>
-          <w:szCs w:val="36"/>
-        </w:rPr>
-        <w:t xml:space="preserve">. </w:t>
-      </w:r>
-      <w:r>
-        <w:rPr>
-          <w:sz w:val="36"/>
-          <w:szCs w:val="36"/>
-        </w:rPr>
-        <w:t>Most beginners write PRs without linking them to issues. This breaks the automation chain completely.</w:t>
-      </w:r>
-    </w:p>
-    <w:p>
-      <w:pPr>
-        <w:jc w:val="both"/>
-        <w:rPr>
-          <w:sz w:val="36"/>
-          <w:szCs w:val="36"/>
-        </w:rPr>
-      </w:pPr>
-      <w:r>
-        <w:rPr>
-          <w:sz w:val="36"/>
-          <w:szCs w:val="36"/>
-        </w:rPr>
-        <w:t xml:space="preserve"># </w:t>
-      </w:r>
-      <w:r>
-        <w:rPr>
-          <w:b/>
-          <w:bCs/>
-          <w:sz w:val="36"/>
-          <w:szCs w:val="36"/>
-        </w:rPr>
-        <w:t>Mistake-3</w:t>
-      </w:r>
-      <w:r>
-        <w:rPr>
-          <w:sz w:val="36"/>
-          <w:szCs w:val="36"/>
-        </w:rPr>
-        <w:t>,</w:t>
-      </w:r>
-      <w:r>
-        <w:rPr>
-          <w:sz w:val="36"/>
-          <w:szCs w:val="36"/>
-        </w:rPr>
-        <w:t xml:space="preserve"> One giant project for everything</w:t>
-      </w:r>
-      <w:r>
-        <w:rPr>
-          <w:sz w:val="36"/>
-          <w:szCs w:val="36"/>
-        </w:rPr>
-        <w:t xml:space="preserve">. </w:t>
-      </w:r>
-      <w:r>
-        <w:rPr>
-          <w:sz w:val="36"/>
-          <w:szCs w:val="36"/>
-        </w:rPr>
-        <w:t>Teams with 5+ repos often put ALL work in one board with no filtering. Use views (saved filters) inside our project to show only "Flutter issues" or "this sprint's work."</w:t>
-      </w:r>
-    </w:p>
-    <w:p>
-      <w:pPr>
-        <w:jc w:val="both"/>
-        <w:rPr>
-          <w:sz w:val="36"/>
-          <w:szCs w:val="36"/>
-        </w:rPr>
-      </w:pPr>
-      <w:r>
-        <w:rPr>
-          <w:sz w:val="36"/>
-          <w:szCs w:val="36"/>
-        </w:rPr>
-        <w:t xml:space="preserve"># </w:t>
-      </w:r>
-      <w:r>
-        <w:rPr>
-          <w:b/>
-          <w:bCs/>
-          <w:sz w:val="36"/>
-          <w:szCs w:val="36"/>
-        </w:rPr>
-        <w:t>Mistake-4</w:t>
-      </w:r>
-      <w:r>
-        <w:rPr>
-          <w:sz w:val="36"/>
-          <w:szCs w:val="36"/>
-        </w:rPr>
-        <w:t>,</w:t>
-      </w:r>
-      <w:r>
-        <w:rPr>
-          <w:sz w:val="36"/>
-          <w:szCs w:val="36"/>
-        </w:rPr>
-        <w:t xml:space="preserve"> Ignoring the Roadmap view</w:t>
-      </w:r>
-      <w:r>
-        <w:rPr>
-          <w:sz w:val="36"/>
-          <w:szCs w:val="36"/>
-        </w:rPr>
-        <w:t xml:space="preserve">. </w:t>
-      </w:r>
-      <w:r>
-        <w:rPr>
-          <w:sz w:val="36"/>
-          <w:szCs w:val="36"/>
-        </w:rPr>
-        <w:t xml:space="preserve">Solo devs never touch it. But when </w:t>
-      </w:r>
-      <w:r>
-        <w:rPr>
-          <w:sz w:val="36"/>
-          <w:szCs w:val="36"/>
-        </w:rPr>
-        <w:t>we</w:t>
-      </w:r>
-      <w:r>
-        <w:rPr>
-          <w:sz w:val="36"/>
-          <w:szCs w:val="36"/>
-        </w:rPr>
-        <w:t xml:space="preserve"> start planning features across weeks, the roadmap view (with iteration fields) is how senior devs think about scope.</w:t>
+        <w:t xml:space="preserve"> start planning features across weeks, the roadmap view (with iteration fields) is how senior </w:t>
+      </w:r>
+      <w:proofErr w:type="spellStart"/>
+      <w:r>
+        <w:rPr>
+          <w:sz w:val="36"/>
+          <w:szCs w:val="36"/>
+        </w:rPr>
+        <w:t>devs</w:t>
+      </w:r>
+      <w:proofErr w:type="spellEnd"/>
+      <w:r>
+        <w:rPr>
+          <w:sz w:val="36"/>
+          <w:szCs w:val="36"/>
+        </w:rPr>
+        <w:t xml:space="preserve"> think about scope.</w:t>
       </w:r>
     </w:p>
     <w:p>
@@ -4236,7 +4967,6 @@
           <w:sz w:val="36"/>
           <w:szCs w:val="36"/>
         </w:rPr>
-        <w:lastRenderedPageBreak/>
         <w:t xml:space="preserve">Priority triage happens weekly and filter by Priority: </w:t>
       </w:r>
       <w:r>
@@ -4274,7 +5004,23 @@
           <w:sz w:val="36"/>
           <w:szCs w:val="36"/>
         </w:rPr>
-        <w:t>GitHub Actions + Projects API, advanced teams use the GraphQL API to programmatically move cards, create issues, or generate weekly reports</w:t>
+        <w:t xml:space="preserve">GitHub Actions + Projects API, advanced teams use the </w:t>
+      </w:r>
+      <w:proofErr w:type="spellStart"/>
+      <w:r>
+        <w:rPr>
+          <w:sz w:val="36"/>
+          <w:szCs w:val="36"/>
+        </w:rPr>
+        <w:t>GraphQL</w:t>
+      </w:r>
+      <w:proofErr w:type="spellEnd"/>
+      <w:r>
+        <w:rPr>
+          <w:sz w:val="36"/>
+          <w:szCs w:val="36"/>
+        </w:rPr>
+        <w:t xml:space="preserve"> API to programmatically move cards, create issues, or generate weekly reports</w:t>
       </w:r>
     </w:p>
     <w:p>
@@ -4295,6 +5041,7 @@
           <w:sz w:val="36"/>
           <w:szCs w:val="36"/>
         </w:rPr>
+        <w:lastRenderedPageBreak/>
         <w:t>Sub-issues (new in 2024) GitHub now supports breaking one issue into sub-tasks directly inside the issue, replacing the old checkbox hack</w:t>
       </w:r>
     </w:p>
@@ -4316,7 +5063,23 @@
           <w:sz w:val="36"/>
           <w:szCs w:val="36"/>
         </w:rPr>
-        <w:t>Milestones vs Projects, Milestones are for version-based releases (v1.0, v2.0). Projects are for ongoing workflow management. Senior devs use both together</w:t>
+        <w:t xml:space="preserve">Milestones vs Projects, Milestones are for version-based releases (v1.0, v2.0). Projects are for ongoing workflow management. Senior </w:t>
+      </w:r>
+      <w:proofErr w:type="spellStart"/>
+      <w:r>
+        <w:rPr>
+          <w:sz w:val="36"/>
+          <w:szCs w:val="36"/>
+        </w:rPr>
+        <w:t>devs</w:t>
+      </w:r>
+      <w:proofErr w:type="spellEnd"/>
+      <w:r>
+        <w:rPr>
+          <w:sz w:val="36"/>
+          <w:szCs w:val="36"/>
+        </w:rPr>
+        <w:t xml:space="preserve"> use both together</w:t>
       </w:r>
     </w:p>
     <w:p>
@@ -6236,7 +6999,6 @@
   <w:style w:type="character" w:default="1" w:styleId="DefaultParagraphFont">
     <w:name w:val="Default Paragraph Font"/>
     <w:uiPriority w:val="1"/>
-    <w:semiHidden/>
     <w:unhideWhenUsed/>
   </w:style>
   <w:style w:type="table" w:default="1" w:styleId="TableNormal">

</xml_diff>